<commit_message>
docs(report): update docx file directly with correct margins, font size, and restructured chapters
</commit_message>
<xml_diff>
--- a/ThuongMai/Graduation_Report_System/BaoCaoInAn/bao cao tot nghiep thuc tap AnKhang.docx
+++ b/ThuongMai/Graduation_Report_System/BaoCaoInAn/bao cao tot nghiep thuc tap AnKhang.docx
@@ -1,5 +1,67 @@
 
-<file path=word/document.xml><?xml version="1.0" encoding="utf-8"?>
+<file path=customXml\item1.xml><?xml version="1.0" encoding="utf-8"?>
+<b:Sources xmlns:b="http://schemas.openxmlformats.org/officeDocument/2006/bibliography" xmlns="http://schemas.openxmlformats.org/officeDocument/2006/bibliography" SelectedStyle="\APASixthEditionOfficeOnline.xsl" StyleName="APA" Version="6"/>
+</file>
+
+<file path=customXml\itemProps1.xml><?xml version="1.0" encoding="utf-8"?>
+<ds:datastoreItem xmlns:ds="http://schemas.openxmlformats.org/officeDocument/2006/customXml" ds:itemID="{C6EDB017-1FD4-4134-B78E-F4DB6640129F}">
+  <ds:schemaRefs>
+    <ds:schemaRef ds:uri="http://schemas.openxmlformats.org/officeDocument/2006/bibliography"/>
+  </ds:schemaRefs>
+</ds:datastoreItem>
+</file>
+
+<file path=docProps\app.xml><?xml version="1.0" encoding="utf-8"?>
+<Properties xmlns="http://schemas.openxmlformats.org/officeDocument/2006/extended-properties" xmlns:vt="http://schemas.openxmlformats.org/officeDocument/2006/docPropsVTypes">
+  <Template>Normal</Template>
+  <TotalTime>1</TotalTime>
+  <Pages>21</Pages>
+  <Words>5744</Words>
+  <Characters>32745</Characters>
+  <Application>Microsoft Office Word</Application>
+  <DocSecurity>0</DocSecurity>
+  <Lines>272</Lines>
+  <Paragraphs>76</Paragraphs>
+  <ScaleCrop>false</ScaleCrop>
+  <HeadingPairs>
+    <vt:vector size="2" baseType="variant">
+      <vt:variant>
+        <vt:lpstr>Title</vt:lpstr>
+      </vt:variant>
+      <vt:variant>
+        <vt:i4>1</vt:i4>
+      </vt:variant>
+    </vt:vector>
+  </HeadingPairs>
+  <TitlesOfParts>
+    <vt:vector size="1" baseType="lpstr">
+      <vt:lpstr/>
+    </vt:vector>
+  </TitlesOfParts>
+  <Company/>
+  <LinksUpToDate>false</LinksUpToDate>
+  <CharactersWithSpaces>38413</CharactersWithSpaces>
+  <SharedDoc>false</SharedDoc>
+  <HyperlinksChanged>false</HyperlinksChanged>
+  <AppVersion>16.0000</AppVersion>
+</Properties>
+</file>
+
+<file path=docProps\core.xml><?xml version="1.0" encoding="utf-8"?>
+<cp:coreProperties xmlns:cp="http://schemas.openxmlformats.org/package/2006/metadata/core-properties" xmlns:dc="http://purl.org/dc/elements/1.1/" xmlns:dcterms="http://purl.org/dc/terms/" xmlns:dcmitype="http://purl.org/dc/dcmitype/" xmlns:xsi="http://www.w3.org/2001/XMLSchema-instance">
+  <dc:title/>
+  <dc:subject/>
+  <dc:creator>DELL</dc:creator>
+  <cp:keywords/>
+  <dc:description/>
+  <cp:lastModifiedBy>Administrator</cp:lastModifiedBy>
+  <cp:revision>2</cp:revision>
+  <dcterms:created xsi:type="dcterms:W3CDTF">2026-07-12T19:58:00Z</dcterms:created>
+  <dcterms:modified xsi:type="dcterms:W3CDTF">2026-07-12T19:58:00Z</dcterms:modified>
+</cp:coreProperties>
+</file>
+
+<file path=word\document.xml><?xml version="1.0" encoding="utf-8"?>
 <w:document xmlns:wpc="http://schemas.microsoft.com/office/word/2010/wordprocessingCanvas" xmlns:cx="http://schemas.microsoft.com/office/drawing/2014/chartex" xmlns:cx1="http://schemas.microsoft.com/office/drawing/2015/9/8/chartex" xmlns:cx2="http://schemas.microsoft.com/office/drawing/2015/10/21/chartex" xmlns:cx3="http://schemas.microsoft.com/office/drawing/2016/5/9/chartex" xmlns:cx4="http://schemas.microsoft.com/office/drawing/2016/5/10/chartex" xmlns:cx5="http://schemas.microsoft.com/office/drawing/2016/5/11/chartex" xmlns:cx6="http://schemas.microsoft.com/office/drawing/2016/5/12/chartex" xmlns:cx7="http://schemas.microsoft.com/office/drawing/2016/5/13/chartex" xmlns:cx8="http://schemas.microsoft.com/office/drawing/2016/5/14/chartex" xmlns:mc="http://schemas.openxmlformats.org/markup-compatibility/2006" xmlns:aink="http://schemas.microsoft.com/office/drawing/2016/ink" xmlns:am3d="http://schemas.microsoft.com/office/drawing/2017/model3d" xmlns:o="urn:schemas-microsoft-com:office:office" xmlns:r="http://schemas.openxmlformats.org/officeDocument/2006/relationships" xmlns:m="http://schemas.openxmlformats.org/officeDocument/2006/math" xmlns:v="urn:schemas-microsoft-com:vml" xmlns:wp14="http://schemas.microsoft.com/office/word/2010/wordprocessingDrawing" xmlns:wp="http://schemas.openxmlformats.org/drawingml/2006/wordprocessingDrawing" xmlns:w10="urn:schemas-microsoft-com:office:word" xmlns:w="http://schemas.openxmlformats.org/wordprocessingml/2006/main" xmlns:w14="http://schemas.microsoft.com/office/word/2010/wordml" xmlns:w15="http://schemas.microsoft.com/office/word/2012/wordml" xmlns:w16cid="http://schemas.microsoft.com/office/word/2016/wordml/cid" xmlns:w16se="http://schemas.microsoft.com/office/word/2015/wordml/symex" xmlns:wpg="http://schemas.microsoft.com/office/word/2010/wordprocessingGroup" xmlns:wpi="http://schemas.microsoft.com/office/word/2010/wordprocessingInk" xmlns:wne="http://schemas.microsoft.com/office/word/2006/wordml" xmlns:wps="http://schemas.microsoft.com/office/word/2010/wordprocessingShape" mc:Ignorable="w14 w15 w16se w16cid wp14">
   <w:body>
     <w:bookmarkStart w:id="0" w:name="_heading=h.gjdgxs" w:colFirst="0" w:colLast="0"/>
@@ -14265,716 +14327,398 @@
     <w:p>
       <w:pPr>
         <w:pStyle w:val="Heading1"/>
-        <w:shd w:val="clear" w:color="auto" w:fill="FFFFFF"/>
-        <w:spacing w:before="360" w:after="240"/>
-        <w:rPr>
-          <w:rFonts w:ascii="Segoe UI" w:hAnsi="Segoe UI" w:cs="Segoe UI"/>
-          <w:color w:val="1F2328"/>
-        </w:rPr>
-      </w:pPr>
-      <w:r>
-        <w:rPr>
-          <w:rFonts w:ascii="Segoe UI" w:hAnsi="Segoe UI" w:cs="Segoe UI"/>
-          <w:color w:val="1F2328"/>
-        </w:rPr>
-        <w:t>PHẦN 3: KẾT LUẬN &amp; HƯỚNG PHÁT TRIỂN ĐỀ TÀI</w:t>
-      </w:r>
-    </w:p>
-    <w:p>
-      <w:pPr>
-        <w:pStyle w:val="Heading3"/>
-        <w:shd w:val="clear" w:color="auto" w:fill="FFFFFF"/>
-        <w:spacing w:before="360" w:after="240"/>
-        <w:rPr>
-          <w:rFonts w:ascii="Segoe UI" w:hAnsi="Segoe UI" w:cs="Segoe UI"/>
-          <w:color w:val="1F2328"/>
-          <w:sz w:val="30"/>
-          <w:szCs w:val="30"/>
-        </w:rPr>
-      </w:pPr>
-      <w:r>
-        <w:rPr>
-          <w:rFonts w:ascii="Segoe UI" w:hAnsi="Segoe UI" w:cs="Segoe UI"/>
-          <w:color w:val="1F2328"/>
-          <w:sz w:val="30"/>
-          <w:szCs w:val="30"/>
-        </w:rPr>
-        <w:t>3.1 Kết luận về kết quả đạt được của đề tài</w:t>
-      </w:r>
-    </w:p>
-    <w:p>
-      <w:pPr>
-        <w:pStyle w:val="NormalWeb"/>
-        <w:shd w:val="clear" w:color="auto" w:fill="FFFFFF"/>
-        <w:spacing w:before="0" w:beforeAutospacing="0" w:after="240" w:afterAutospacing="0"/>
-        <w:rPr>
-          <w:rFonts w:ascii="Segoe UI" w:hAnsi="Segoe UI" w:cs="Segoe UI"/>
-          <w:color w:val="1F2328"/>
-        </w:rPr>
-      </w:pPr>
-      <w:r>
-        <w:rPr>
-          <w:rFonts w:ascii="Segoe UI" w:hAnsi="Segoe UI" w:cs="Segoe UI"/>
-          <w:color w:val="1F2328"/>
-        </w:rPr>
-        <w:t>Sau 8 tuần thực tập tốt nghiệp đầy nỗ lực tại </w:t>
-      </w:r>
-      <w:r>
-        <w:rPr>
-          <w:rStyle w:val="Strong"/>
-          <w:rFonts w:ascii="Segoe UI" w:hAnsi="Segoe UI" w:cs="Segoe UI"/>
-          <w:color w:val="1F2328"/>
-        </w:rPr>
-        <w:t>Công ty Cổ phần SweetSoft</w:t>
-      </w:r>
-      <w:r>
-        <w:rPr>
-          <w:rFonts w:ascii="Segoe UI" w:hAnsi="Segoe UI" w:cs="Segoe UI"/>
-          <w:color w:val="1F2328"/>
-        </w:rPr>
-        <w:t> dưới sự giảng dạy hướng dẫn sát sao của cô </w:t>
-      </w:r>
-      <w:r>
-        <w:rPr>
-          <w:rStyle w:val="Strong"/>
-          <w:rFonts w:ascii="Segoe UI" w:hAnsi="Segoe UI" w:cs="Segoe UI"/>
-          <w:color w:val="1F2328"/>
-        </w:rPr>
-        <w:t>Hồ Thị Thanh Diệu</w:t>
-      </w:r>
-      <w:r>
-        <w:rPr>
-          <w:rFonts w:ascii="Segoe UI" w:hAnsi="Segoe UI" w:cs="Segoe UI"/>
-          <w:color w:val="1F2328"/>
-        </w:rPr>
-        <w:t>, em đã hoàn thành toàn bộ các yêu cầu chức năng và kỹ thuật của hệ thống thương mại điện tử DECKKO Classic:</w:t>
-      </w:r>
-    </w:p>
-    <w:p>
-      <w:pPr>
-        <w:numPr>
-          <w:ilvl w:val="0"/>
-          <w:numId w:val="13"/>
-        </w:numPr>
-        <w:shd w:val="clear" w:color="auto" w:fill="FFFFFF"/>
-        <w:spacing w:before="100" w:beforeAutospacing="1" w:after="100" w:afterAutospacing="1"/>
-        <w:rPr>
-          <w:rFonts w:ascii="Segoe UI" w:hAnsi="Segoe UI" w:cs="Segoe UI"/>
-          <w:color w:val="1F2328"/>
-        </w:rPr>
-      </w:pPr>
-      <w:r>
-        <w:rPr>
-          <w:rFonts w:ascii="Segoe UI" w:hAnsi="Segoe UI" w:cs="Segoe UI"/>
-          <w:color w:val="1F2328"/>
-        </w:rPr>
-        <w:lastRenderedPageBreak/>
-        <w:t>Thiết kế và xây dựng thành công website trực tuyến giao diện responsive mượt mà, tối ưu hóa tốc độ tải trang dưới 1.2 giây và cấu hình SEO chuẩn.</w:t>
-      </w:r>
-    </w:p>
-    <w:p>
-      <w:pPr>
-        <w:numPr>
-          <w:ilvl w:val="0"/>
-          <w:numId w:val="13"/>
-        </w:numPr>
-        <w:shd w:val="clear" w:color="auto" w:fill="FFFFFF"/>
-        <w:spacing w:before="60" w:after="100" w:afterAutospacing="1"/>
-        <w:rPr>
-          <w:rFonts w:ascii="Segoe UI" w:hAnsi="Segoe UI" w:cs="Segoe UI"/>
-          <w:color w:val="1F2328"/>
-        </w:rPr>
-      </w:pPr>
-      <w:r>
-        <w:rPr>
-          <w:rFonts w:ascii="Segoe UI" w:hAnsi="Segoe UI" w:cs="Segoe UI"/>
-          <w:color w:val="1F2328"/>
-        </w:rPr>
-        <w:t>Xây dựng cơ sở dữ liệu quan hệ PostgreSQL và tích hợp thành công giải pháp tìm kiếm ngữ nghĩa Semantic RAG Search sử dụng Vector DB Qdrant.</w:t>
-      </w:r>
-    </w:p>
-    <w:p>
-      <w:pPr>
-        <w:numPr>
-          <w:ilvl w:val="0"/>
-          <w:numId w:val="13"/>
-        </w:numPr>
-        <w:shd w:val="clear" w:color="auto" w:fill="FFFFFF"/>
-        <w:spacing w:before="60" w:after="100" w:afterAutospacing="1"/>
-        <w:rPr>
-          <w:rFonts w:ascii="Segoe UI" w:hAnsi="Segoe UI" w:cs="Segoe UI"/>
-          <w:color w:val="1F2328"/>
-        </w:rPr>
-      </w:pPr>
-      <w:r>
-        <w:rPr>
-          <w:rFonts w:ascii="Segoe UI" w:hAnsi="Segoe UI" w:cs="Segoe UI"/>
-          <w:color w:val="1F2328"/>
-        </w:rPr>
-        <w:t>Chatbot AI trợ lý mua sắm hoạt động ổn định, phản hồi tư vấn kích cỡ và chất liệu vải tre Bamboo tự nhiên chính xác theo thời gian thực mà không bị ảo giác.</w:t>
-      </w:r>
-    </w:p>
-    <w:p>
-      <w:pPr>
-        <w:numPr>
-          <w:ilvl w:val="0"/>
-          <w:numId w:val="13"/>
-        </w:numPr>
-        <w:shd w:val="clear" w:color="auto" w:fill="FFFFFF"/>
-        <w:spacing w:before="60" w:after="100" w:afterAutospacing="1"/>
-        <w:rPr>
-          <w:rFonts w:ascii="Segoe UI" w:hAnsi="Segoe UI" w:cs="Segoe UI"/>
-          <w:color w:val="1F2328"/>
-        </w:rPr>
-      </w:pPr>
-      <w:r>
-        <w:rPr>
-          <w:rFonts w:ascii="Segoe UI" w:hAnsi="Segoe UI" w:cs="Segoe UI"/>
-          <w:color w:val="1F2328"/>
-        </w:rPr>
-        <w:t>Khắc phục triệt để lỗ hổng bảo mật đăng nhập và loại bỏ toàn bộ mật khẩu cứng (credentials) trong mã nguồn.</w:t>
-      </w:r>
-    </w:p>
-    <w:p>
-      <w:pPr>
-        <w:numPr>
-          <w:ilvl w:val="0"/>
-          <w:numId w:val="13"/>
-        </w:numPr>
-        <w:shd w:val="clear" w:color="auto" w:fill="FFFFFF"/>
-        <w:spacing w:before="60" w:after="100" w:afterAutospacing="1"/>
-        <w:rPr>
-          <w:rFonts w:ascii="Segoe UI" w:hAnsi="Segoe UI" w:cs="Segoe UI"/>
-          <w:color w:val="1F2328"/>
-        </w:rPr>
-      </w:pPr>
-      <w:r>
-        <w:rPr>
-          <w:rFonts w:ascii="Segoe UI" w:hAnsi="Segoe UI" w:cs="Segoe UI"/>
-          <w:color w:val="1F2328"/>
-        </w:rPr>
-        <w:t>Biên dịch dự án Next.js thành công 100% không gặp lỗi TypeScript Compiler và deploy ứng dụng trực tuyến thành công trên Firebase Hosting.</w:t>
-      </w:r>
-    </w:p>
-    <w:p>
-      <w:pPr>
-        <w:pStyle w:val="Heading3"/>
-        <w:shd w:val="clear" w:color="auto" w:fill="FFFFFF"/>
-        <w:spacing w:before="360" w:after="240"/>
-        <w:rPr>
-          <w:rFonts w:ascii="Segoe UI" w:hAnsi="Segoe UI" w:cs="Segoe UI"/>
-          <w:color w:val="1F2328"/>
-          <w:sz w:val="30"/>
-          <w:szCs w:val="30"/>
-        </w:rPr>
-      </w:pPr>
-      <w:r>
-        <w:rPr>
-          <w:rFonts w:ascii="Segoe UI" w:hAnsi="Segoe UI" w:cs="Segoe UI"/>
-          <w:color w:val="1F2328"/>
-          <w:sz w:val="30"/>
-          <w:szCs w:val="30"/>
-        </w:rPr>
-        <w:t>3.2 Hướng phát triển nâng cấp đề tài trong tương lai</w:t>
-      </w:r>
-    </w:p>
-    <w:p>
-      <w:pPr>
-        <w:pStyle w:val="NormalWeb"/>
-        <w:shd w:val="clear" w:color="auto" w:fill="FFFFFF"/>
-        <w:spacing w:before="0" w:beforeAutospacing="0" w:after="240" w:afterAutospacing="0"/>
-        <w:rPr>
-          <w:rFonts w:ascii="Segoe UI" w:hAnsi="Segoe UI" w:cs="Segoe UI"/>
-          <w:color w:val="1F2328"/>
-        </w:rPr>
-      </w:pPr>
-      <w:r>
-        <w:rPr>
-          <w:rFonts w:ascii="Segoe UI" w:hAnsi="Segoe UI" w:cs="Segoe UI"/>
-          <w:color w:val="1F2328"/>
-        </w:rPr>
-        <w:t>Để hệ thống có tính ứng dụng cao hơn và sẵn sàng thương mại hóa thực tế trên thị trường, dự án có thể phát triển thêm các hướng:</w:t>
-      </w:r>
-    </w:p>
-    <w:p>
-      <w:pPr>
-        <w:numPr>
-          <w:ilvl w:val="0"/>
-          <w:numId w:val="14"/>
-        </w:numPr>
-        <w:shd w:val="clear" w:color="auto" w:fill="FFFFFF"/>
-        <w:spacing w:before="100" w:beforeAutospacing="1" w:after="100" w:afterAutospacing="1"/>
-        <w:rPr>
-          <w:rFonts w:ascii="Segoe UI" w:hAnsi="Segoe UI" w:cs="Segoe UI"/>
-          <w:color w:val="1F2328"/>
-        </w:rPr>
-      </w:pPr>
-      <w:r>
-        <w:rPr>
-          <w:rFonts w:ascii="Segoe UI" w:hAnsi="Segoe UI" w:cs="Segoe UI"/>
-          <w:color w:val="1F2328"/>
-        </w:rPr>
-        <w:t>Kết nối toàn bộ giỏ hàng và thanh toán Frontend với PostgreSQL database thông qua hệ thống API Backend Laravel hoàn chỉnh thay vì lưu trữ cục bộ qua localStorage của client.</w:t>
-      </w:r>
-    </w:p>
-    <w:p>
-      <w:pPr>
-        <w:numPr>
-          <w:ilvl w:val="0"/>
-          <w:numId w:val="14"/>
-        </w:numPr>
-        <w:shd w:val="clear" w:color="auto" w:fill="FFFFFF"/>
-        <w:spacing w:before="60" w:after="100" w:afterAutospacing="1"/>
-        <w:rPr>
-          <w:rFonts w:ascii="Segoe UI" w:hAnsi="Segoe UI" w:cs="Segoe UI"/>
-          <w:color w:val="1F2328"/>
-        </w:rPr>
-      </w:pPr>
-      <w:r>
-        <w:rPr>
-          <w:rFonts w:ascii="Segoe UI" w:hAnsi="Segoe UI" w:cs="Segoe UI"/>
-          <w:color w:val="1F2328"/>
-        </w:rPr>
-        <w:t>Tích hợp cổng thanh toán trực tuyến thực tế (VNPAY, MoMo, VNPT Pay) giúp khách hàng có thể thực hiện thanh toán trực tuyến an toàn.</w:t>
-      </w:r>
-    </w:p>
-    <w:p>
-      <w:pPr>
-        <w:numPr>
-          <w:ilvl w:val="0"/>
-          <w:numId w:val="14"/>
-        </w:numPr>
-        <w:shd w:val="clear" w:color="auto" w:fill="FFFFFF"/>
-        <w:spacing w:before="60" w:after="100" w:afterAutospacing="1"/>
-        <w:rPr>
-          <w:rFonts w:ascii="Segoe UI" w:hAnsi="Segoe UI" w:cs="Segoe UI"/>
-          <w:color w:val="1F2328"/>
-        </w:rPr>
-      </w:pPr>
-      <w:r>
-        <w:rPr>
-          <w:rFonts w:ascii="Segoe UI" w:hAnsi="Segoe UI" w:cs="Segoe UI"/>
-          <w:color w:val="1F2328"/>
-        </w:rPr>
-        <w:t>Xây dựng hệ thống gợi ý sản phẩm cá nhân hóa (Recommendation System) dựa trên hành vi duyệt web và lịch sử mua sắm của từng khách hàng cụ thể thông qua học máy (Machine Learning).</w:t>
-      </w:r>
-    </w:p>
-    <w:p>
-      <w:pPr>
-        <w:spacing w:before="360" w:after="360"/>
-      </w:pPr>
-      <w:r>
-        <w:pict w14:anchorId="6F6D7C2F">
-          <v:rect id="_x0000_i1032" style="width:0;height:3pt" o:hralign="center" o:hrstd="t" o:hr="t" fillcolor="#a0a0a0" stroked="f"/>
-        </w:pict>
-      </w:r>
-    </w:p>
-    <w:p>
-      <w:pPr>
-        <w:pStyle w:val="Heading1"/>
-        <w:shd w:val="clear" w:color="auto" w:fill="FFFFFF"/>
-        <w:spacing w:before="360" w:after="240"/>
-        <w:rPr>
-          <w:rFonts w:ascii="Segoe UI" w:hAnsi="Segoe UI" w:cs="Segoe UI"/>
-          <w:color w:val="1F2328"/>
-        </w:rPr>
-      </w:pPr>
-      <w:r>
-        <w:rPr>
-          <w:rFonts w:ascii="Segoe UI" w:hAnsi="Segoe UI" w:cs="Segoe UI"/>
-          <w:color w:val="1F2328"/>
-        </w:rPr>
-        <w:t>DANH MỤC TÀI LIỆU THAM KHẢO</w:t>
-      </w:r>
-    </w:p>
-    <w:p>
-      <w:pPr>
-        <w:numPr>
-          <w:ilvl w:val="0"/>
-          <w:numId w:val="15"/>
-        </w:numPr>
-        <w:shd w:val="clear" w:color="auto" w:fill="FFFFFF"/>
-        <w:spacing w:before="100" w:beforeAutospacing="1" w:after="100" w:afterAutospacing="1"/>
-        <w:rPr>
-          <w:rFonts w:ascii="Segoe UI" w:hAnsi="Segoe UI" w:cs="Segoe UI"/>
-          <w:color w:val="1F2328"/>
-        </w:rPr>
-      </w:pPr>
-      <w:r>
-        <w:rPr>
-          <w:rStyle w:val="Strong"/>
-          <w:rFonts w:ascii="Segoe UI" w:hAnsi="Segoe UI" w:cs="Segoe UI"/>
-          <w:color w:val="1F2328"/>
-        </w:rPr>
-        <w:t>Trần Minh Chánh</w:t>
-      </w:r>
-      <w:r>
-        <w:rPr>
-          <w:rFonts w:ascii="Segoe UI" w:hAnsi="Segoe UI" w:cs="Segoe UI"/>
-          <w:color w:val="1F2328"/>
-        </w:rPr>
-        <w:t>, </w:t>
-      </w:r>
-      <w:r>
-        <w:rPr>
-          <w:rStyle w:val="Emphasis"/>
-          <w:rFonts w:ascii="Segoe UI" w:eastAsiaTheme="majorEastAsia" w:hAnsi="Segoe UI" w:cs="Segoe UI"/>
-          <w:color w:val="1F2328"/>
-        </w:rPr>
-        <w:t>Giáo trình Phân cứng máy tính và Kiến trúc hệ thống</w:t>
-      </w:r>
-      <w:r>
-        <w:rPr>
-          <w:rFonts w:ascii="Segoe UI" w:hAnsi="Segoe UI" w:cs="Segoe UI"/>
-          <w:color w:val="1F2328"/>
-        </w:rPr>
-        <w:t>, Nhà xuất bản Giáo dục Việt Nam, Hà Nội, 2020.</w:t>
-      </w:r>
-    </w:p>
-    <w:p>
-      <w:pPr>
-        <w:numPr>
-          <w:ilvl w:val="0"/>
-          <w:numId w:val="15"/>
-        </w:numPr>
-        <w:shd w:val="clear" w:color="auto" w:fill="FFFFFF"/>
-        <w:spacing w:before="60" w:after="100" w:afterAutospacing="1"/>
-        <w:rPr>
-          <w:rFonts w:ascii="Segoe UI" w:hAnsi="Segoe UI" w:cs="Segoe UI"/>
-          <w:color w:val="1F2328"/>
-        </w:rPr>
-      </w:pPr>
-      <w:r>
-        <w:rPr>
-          <w:rStyle w:val="Strong"/>
-          <w:rFonts w:ascii="Segoe UI" w:hAnsi="Segoe UI" w:cs="Segoe UI"/>
-          <w:color w:val="1F2328"/>
-        </w:rPr>
-        <w:t>Nguyễn Văn A</w:t>
-      </w:r>
-      <w:r>
-        <w:rPr>
-          <w:rFonts w:ascii="Segoe UI" w:hAnsi="Segoe UI" w:cs="Segoe UI"/>
-          <w:color w:val="1F2328"/>
-        </w:rPr>
-        <w:t>, </w:t>
-      </w:r>
-      <w:r>
-        <w:rPr>
-          <w:rStyle w:val="Emphasis"/>
-          <w:rFonts w:ascii="Segoe UI" w:eastAsiaTheme="majorEastAsia" w:hAnsi="Segoe UI" w:cs="Segoe UI"/>
-          <w:color w:val="1F2328"/>
-        </w:rPr>
-        <w:t>Cơ sở Công nghệ Thông tin và Phát triển Web hiện đại</w:t>
-      </w:r>
-      <w:r>
-        <w:rPr>
-          <w:rFonts w:ascii="Segoe UI" w:hAnsi="Segoe UI" w:cs="Segoe UI"/>
-          <w:color w:val="1F2328"/>
-        </w:rPr>
-        <w:t>, Nhà xuất bản Thống kê, Hà Nội, 2019.</w:t>
-      </w:r>
-    </w:p>
-    <w:p>
-      <w:pPr>
-        <w:numPr>
-          <w:ilvl w:val="0"/>
-          <w:numId w:val="15"/>
-        </w:numPr>
-        <w:shd w:val="clear" w:color="auto" w:fill="FFFFFF"/>
-        <w:spacing w:before="60" w:after="100" w:afterAutospacing="1"/>
-        <w:rPr>
-          <w:rFonts w:ascii="Segoe UI" w:hAnsi="Segoe UI" w:cs="Segoe UI"/>
-          <w:color w:val="1F2328"/>
-        </w:rPr>
-      </w:pPr>
-      <w:r>
-        <w:rPr>
-          <w:rStyle w:val="Strong"/>
-          <w:rFonts w:ascii="Segoe UI" w:hAnsi="Segoe UI" w:cs="Segoe UI"/>
-          <w:color w:val="1F2328"/>
-        </w:rPr>
-        <w:t>Lê Hoàng Nam</w:t>
-      </w:r>
-      <w:r>
-        <w:rPr>
-          <w:rFonts w:ascii="Segoe UI" w:hAnsi="Segoe UI" w:cs="Segoe UI"/>
-          <w:color w:val="1F2328"/>
-        </w:rPr>
-        <w:t>, </w:t>
-      </w:r>
-      <w:r>
-        <w:rPr>
-          <w:rStyle w:val="Emphasis"/>
-          <w:rFonts w:ascii="Segoe UI" w:eastAsiaTheme="majorEastAsia" w:hAnsi="Segoe UI" w:cs="Segoe UI"/>
-          <w:color w:val="1F2328"/>
-        </w:rPr>
-        <w:t>Quản trị hệ thống và bảo trì mạng doanh nghiệp</w:t>
-      </w:r>
-      <w:r>
-        <w:rPr>
-          <w:rFonts w:ascii="Segoe UI" w:hAnsi="Segoe UI" w:cs="Segoe UI"/>
-          <w:color w:val="1F2328"/>
-        </w:rPr>
-        <w:t>, Nhà xuất bản Lao động – Xã hội, 2021.</w:t>
-      </w:r>
-    </w:p>
-    <w:p>
-      <w:pPr>
-        <w:numPr>
-          <w:ilvl w:val="0"/>
-          <w:numId w:val="15"/>
-        </w:numPr>
-        <w:shd w:val="clear" w:color="auto" w:fill="FFFFFF"/>
-        <w:spacing w:before="60" w:after="100" w:afterAutospacing="1"/>
-        <w:rPr>
-          <w:rFonts w:ascii="Segoe UI" w:hAnsi="Segoe UI" w:cs="Segoe UI"/>
-          <w:color w:val="1F2328"/>
-        </w:rPr>
-      </w:pPr>
-      <w:r>
-        <w:rPr>
-          <w:rStyle w:val="Strong"/>
-          <w:rFonts w:ascii="Segoe UI" w:hAnsi="Segoe UI" w:cs="Segoe UI"/>
-          <w:color w:val="1F2328"/>
-        </w:rPr>
-        <w:t>Qdrant Documentation</w:t>
-      </w:r>
-      <w:r>
-        <w:rPr>
-          <w:rFonts w:ascii="Segoe UI" w:hAnsi="Segoe UI" w:cs="Segoe UI"/>
-          <w:color w:val="1F2328"/>
-        </w:rPr>
-        <w:t>, </w:t>
-      </w:r>
-      <w:r>
-        <w:rPr>
-          <w:rStyle w:val="Emphasis"/>
-          <w:rFonts w:ascii="Segoe UI" w:eastAsiaTheme="majorEastAsia" w:hAnsi="Segoe UI" w:cs="Segoe UI"/>
-          <w:color w:val="1F2328"/>
-        </w:rPr>
-        <w:t>Vector Database for Semantic Search and Neural Networks Query</w:t>
-      </w:r>
-      <w:r>
-        <w:rPr>
-          <w:rFonts w:ascii="Segoe UI" w:hAnsi="Segoe UI" w:cs="Segoe UI"/>
-          <w:color w:val="1F2328"/>
-        </w:rPr>
-        <w:t>, </w:t>
-      </w:r>
-      <w:hyperlink r:id="rId10" w:history="1">
-        <w:r>
-          <w:rPr>
-            <w:rStyle w:val="Hyperlink"/>
-            <w:rFonts w:ascii="Segoe UI" w:hAnsi="Segoe UI" w:cs="Segoe UI"/>
-            <w:color w:val="0969DA"/>
-          </w:rPr>
-          <w:t>https://qdrant.tech/documentation/</w:t>
-        </w:r>
-      </w:hyperlink>
-      <w:r>
-        <w:rPr>
-          <w:rFonts w:ascii="Segoe UI" w:hAnsi="Segoe UI" w:cs="Segoe UI"/>
-          <w:color w:val="1F2328"/>
-        </w:rPr>
-        <w:t>, 2026.</w:t>
-      </w:r>
-    </w:p>
-    <w:p>
-      <w:pPr>
-        <w:numPr>
-          <w:ilvl w:val="0"/>
-          <w:numId w:val="15"/>
-        </w:numPr>
-        <w:shd w:val="clear" w:color="auto" w:fill="FFFFFF"/>
-        <w:spacing w:before="60" w:after="100" w:afterAutospacing="1"/>
-        <w:rPr>
-          <w:rFonts w:ascii="Segoe UI" w:hAnsi="Segoe UI" w:cs="Segoe UI"/>
-          <w:color w:val="1F2328"/>
-        </w:rPr>
-      </w:pPr>
-      <w:r>
-        <w:rPr>
-          <w:rStyle w:val="Strong"/>
-          <w:rFonts w:ascii="Segoe UI" w:hAnsi="Segoe UI" w:cs="Segoe UI"/>
-          <w:color w:val="1F2328"/>
-        </w:rPr>
-        <w:t>Next.js Core Team</w:t>
-      </w:r>
-      <w:r>
-        <w:rPr>
-          <w:rFonts w:ascii="Segoe UI" w:hAnsi="Segoe UI" w:cs="Segoe UI"/>
-          <w:color w:val="1F2328"/>
-        </w:rPr>
-        <w:t>, </w:t>
-      </w:r>
-      <w:r>
-        <w:rPr>
-          <w:rStyle w:val="Emphasis"/>
-          <w:rFonts w:ascii="Segoe UI" w:eastAsiaTheme="majorEastAsia" w:hAnsi="Segoe UI" w:cs="Segoe UI"/>
-          <w:color w:val="1F2328"/>
-        </w:rPr>
-        <w:t>Next.js 16 App Router Architecture and Rendering Optimization</w:t>
-      </w:r>
-      <w:r>
-        <w:rPr>
-          <w:rFonts w:ascii="Segoe UI" w:hAnsi="Segoe UI" w:cs="Segoe UI"/>
-          <w:color w:val="1F2328"/>
-        </w:rPr>
-        <w:t>, </w:t>
-      </w:r>
-      <w:hyperlink r:id="rId11" w:history="1">
-        <w:r>
-          <w:rPr>
-            <w:rStyle w:val="Hyperlink"/>
-            <w:rFonts w:ascii="Segoe UI" w:hAnsi="Segoe UI" w:cs="Segoe UI"/>
-            <w:color w:val="0969DA"/>
-          </w:rPr>
-          <w:t>https://nextjs.org/docs</w:t>
-        </w:r>
-      </w:hyperlink>
-      <w:r>
-        <w:rPr>
-          <w:rFonts w:ascii="Segoe UI" w:hAnsi="Segoe UI" w:cs="Segoe UI"/>
-          <w:color w:val="1F2328"/>
-        </w:rPr>
-        <w:t>, 2026.</w:t>
-      </w:r>
-    </w:p>
-    <w:p>
-      <w:pPr>
-        <w:numPr>
-          <w:ilvl w:val="0"/>
-          <w:numId w:val="15"/>
-        </w:numPr>
-        <w:shd w:val="clear" w:color="auto" w:fill="FFFFFF"/>
-        <w:spacing w:before="60" w:after="100" w:afterAutospacing="1"/>
-        <w:rPr>
-          <w:rFonts w:ascii="Segoe UI" w:hAnsi="Segoe UI" w:cs="Segoe UI"/>
-          <w:color w:val="1F2328"/>
-        </w:rPr>
-      </w:pPr>
-      <w:r>
-        <w:rPr>
-          <w:rStyle w:val="Strong"/>
-          <w:rFonts w:ascii="Segoe UI" w:hAnsi="Segoe UI" w:cs="Segoe UI"/>
-          <w:color w:val="1F2328"/>
-        </w:rPr>
-        <w:lastRenderedPageBreak/>
-        <w:t>Laravel Documentation</w:t>
-      </w:r>
-      <w:r>
-        <w:rPr>
-          <w:rFonts w:ascii="Segoe UI" w:hAnsi="Segoe UI" w:cs="Segoe UI"/>
-          <w:color w:val="1F2328"/>
-        </w:rPr>
-        <w:t>, </w:t>
-      </w:r>
-      <w:r>
-        <w:rPr>
-          <w:rStyle w:val="Emphasis"/>
-          <w:rFonts w:ascii="Segoe UI" w:eastAsiaTheme="majorEastAsia" w:hAnsi="Segoe UI" w:cs="Segoe UI"/>
-          <w:color w:val="1F2328"/>
-        </w:rPr>
-        <w:t>Database Transactions and Pessimistic Locking Mechanisms</w:t>
-      </w:r>
-      <w:r>
-        <w:rPr>
-          <w:rFonts w:ascii="Segoe UI" w:hAnsi="Segoe UI" w:cs="Segoe UI"/>
-          <w:color w:val="1F2328"/>
-        </w:rPr>
-        <w:t>, </w:t>
-      </w:r>
-      <w:hyperlink r:id="rId12" w:history="1">
-        <w:r>
-          <w:rPr>
-            <w:rStyle w:val="Hyperlink"/>
-            <w:rFonts w:ascii="Segoe UI" w:hAnsi="Segoe UI" w:cs="Segoe UI"/>
-            <w:color w:val="0969DA"/>
-          </w:rPr>
-          <w:t>https://laravel.com/docs/11.x/database</w:t>
-        </w:r>
-      </w:hyperlink>
-      <w:r>
-        <w:rPr>
-          <w:rFonts w:ascii="Segoe UI" w:hAnsi="Segoe UI" w:cs="Segoe UI"/>
-          <w:color w:val="1F2328"/>
-        </w:rPr>
-        <w:t>, 2026.</w:t>
-      </w:r>
-    </w:p>
-    <w:p>
-      <w:pPr>
-        <w:numPr>
-          <w:ilvl w:val="0"/>
-          <w:numId w:val="15"/>
-        </w:numPr>
-        <w:shd w:val="clear" w:color="auto" w:fill="FFFFFF"/>
-        <w:spacing w:before="60" w:after="100" w:afterAutospacing="1"/>
-        <w:rPr>
-          <w:rFonts w:ascii="Segoe UI" w:hAnsi="Segoe UI" w:cs="Segoe UI"/>
-          <w:color w:val="1F2328"/>
-        </w:rPr>
-      </w:pPr>
-      <w:r>
-        <w:rPr>
-          <w:rStyle w:val="Strong"/>
-          <w:rFonts w:ascii="Segoe UI" w:hAnsi="Segoe UI" w:cs="Segoe UI"/>
-          <w:color w:val="1F2328"/>
-        </w:rPr>
-        <w:t>APA Style Guide (7th Edition)</w:t>
-      </w:r>
-      <w:r>
-        <w:rPr>
-          <w:rFonts w:ascii="Segoe UI" w:hAnsi="Segoe UI" w:cs="Segoe UI"/>
-          <w:color w:val="1F2328"/>
-        </w:rPr>
-        <w:t>, </w:t>
-      </w:r>
-      <w:r>
-        <w:rPr>
-          <w:rStyle w:val="Emphasis"/>
-          <w:rFonts w:ascii="Segoe UI" w:eastAsiaTheme="majorEastAsia" w:hAnsi="Segoe UI" w:cs="Segoe UI"/>
-          <w:color w:val="1F2328"/>
-        </w:rPr>
-        <w:t>Academic Writing and Citation Standards</w:t>
-      </w:r>
-      <w:r>
-        <w:rPr>
-          <w:rFonts w:ascii="Segoe UI" w:hAnsi="Segoe UI" w:cs="Segoe UI"/>
-          <w:color w:val="1F2328"/>
-        </w:rPr>
-        <w:t>, </w:t>
-      </w:r>
-      <w:hyperlink r:id="rId13" w:history="1">
-        <w:r>
-          <w:rPr>
-            <w:rStyle w:val="Hyperlink"/>
-            <w:rFonts w:ascii="Segoe UI" w:hAnsi="Segoe UI" w:cs="Segoe UI"/>
-            <w:color w:val="0969DA"/>
-          </w:rPr>
-          <w:t>https://apastyle.apa.org/</w:t>
-        </w:r>
-      </w:hyperlink>
-      <w:r>
-        <w:rPr>
-          <w:rFonts w:ascii="Segoe UI" w:hAnsi="Segoe UI" w:cs="Segoe UI"/>
-          <w:color w:val="1F2328"/>
-        </w:rPr>
-        <w:t>, 2026.</w:t>
-      </w:r>
-    </w:p>
-    <w:p/>
-    <w:p>
-      <w:pPr>
-        <w:spacing w:before="120" w:after="120" w:line="360" w:lineRule="auto"/>
-        <w:ind w:left="567"/>
-        <w:jc w:val="both"/>
-        <w:rPr>
+        <w:spacing w:before="240" w:after="120"/>
+        <w:rPr>
+          <w:rFonts w:ascii="Times New Roman" w:hAnsi="Times New Roman" w:cs="Times New Roman"/>
           <w:sz w:val="28"/>
           <w:szCs w:val="28"/>
-        </w:rPr>
-      </w:pPr>
+          <w:b/>
+        </w:rPr>
+      </w:pPr>
+      <w:r>
+        <w:rPr>
+          <w:rFonts w:ascii="Times New Roman" w:hAnsi="Times New Roman" w:cs="Times New Roman"/>
+          <w:sz w:val="28"/>
+          <w:szCs w:val="28"/>
+          <w:b/>
+        </w:rPr>
+        <w:t>KẾT LUẬN</w:t>
+      </w:r>
+    </w:p>
+    <w:p>
+      <w:pPr>
+        <w:spacing w:before="60" w:after="100" w:line="360" w:lineRule="auto"/>
+        <w:jc w:val="both"/>
+        <w:rPr>
+          <w:rFonts w:ascii="Times New Roman" w:hAnsi="Times New Roman" w:cs="Times New Roman"/>
+          <w:sz w:val="28"/>
+          <w:szCs w:val="28"/>
+        </w:rPr>
+      </w:pPr>
+      <w:r>
+        <w:rPr>
+          <w:rFonts w:ascii="Times New Roman" w:hAnsi="Times New Roman" w:cs="Times New Roman"/>
+          <w:sz w:val="28"/>
+          <w:szCs w:val="28"/>
+        </w:rPr>
+        <w:t>Sau 8 tuần thực tập tốt nghiệp đầy nỗ lực tại Công ty Cổ phần SweetSoft dưới sự giảng dạy hướng dẫn sát sao của cô Hồ Thị Thanh Diệu, sinh viên đã nghiên cứu lý thuyết kiến trúc Web phân tách và hoàn thành thiết kế, xây dựng thành công website trực tuyến E-commerce DECKKO:</w:t>
+      </w:r>
+    </w:p>
+    <w:p>
+      <w:pPr>
+        <w:spacing w:before="60" w:after="100" w:line="360" w:lineRule="auto"/>
+        <w:jc w:val="both"/>
+        <w:rPr>
+          <w:rFonts w:ascii="Times New Roman" w:hAnsi="Times New Roman" w:cs="Times New Roman"/>
+          <w:sz w:val="28"/>
+          <w:szCs w:val="28"/>
+        </w:rPr>
+      </w:pPr>
+      <w:r>
+        <w:rPr>
+          <w:rFonts w:ascii="Times New Roman" w:hAnsi="Times New Roman" w:cs="Times New Roman"/>
+          <w:sz w:val="28"/>
+          <w:szCs w:val="28"/>
+        </w:rPr>
+        <w:t>•  Thiết kế giao diện responsive tối ưu, hoạt động mượt mà trên cả máy tính và thiết bị di động, cấu hình metadata SEO đầy đủ.</w:t>
+      </w:r>
+    </w:p>
+    <w:p>
+      <w:pPr>
+        <w:spacing w:before="60" w:after="100" w:line="360" w:lineRule="auto"/>
+        <w:jc w:val="both"/>
+        <w:rPr>
+          <w:rFonts w:ascii="Times New Roman" w:hAnsi="Times New Roman" w:cs="Times New Roman"/>
+          <w:sz w:val="28"/>
+          <w:szCs w:val="28"/>
+        </w:rPr>
+      </w:pPr>
+      <w:r>
+        <w:rPr>
+          <w:rFonts w:ascii="Times New Roman" w:hAnsi="Times New Roman" w:cs="Times New Roman"/>
+          <w:sz w:val="28"/>
+          <w:szCs w:val="28"/>
+        </w:rPr>
+        <w:t>•  Hiện thực hóa giao diện bằng code Next.js 16 App Router và Tailwind CSS v4, tối ưu hóa tốc độ tải trang dưới 1.2 giây.</w:t>
+      </w:r>
+    </w:p>
+    <w:p>
+      <w:pPr>
+        <w:spacing w:before="60" w:after="100" w:line="360" w:lineRule="auto"/>
+        <w:jc w:val="both"/>
+        <w:rPr>
+          <w:rFonts w:ascii="Times New Roman" w:hAnsi="Times New Roman" w:cs="Times New Roman"/>
+          <w:sz w:val="28"/>
+          <w:szCs w:val="28"/>
+        </w:rPr>
+      </w:pPr>
+      <w:r>
+        <w:rPr>
+          <w:rFonts w:ascii="Times New Roman" w:hAnsi="Times New Roman" w:cs="Times New Roman"/>
+          <w:sz w:val="28"/>
+          <w:szCs w:val="28"/>
+        </w:rPr>
+        <w:t>•  Xây dựng cơ sở dữ liệu quan hệ PostgreSQL và giả lập giỏ hàng, thanh toán, quản lý đơn hàng cục bộ phía Client qua localStorage.</w:t>
+      </w:r>
+    </w:p>
+    <w:p>
+      <w:pPr>
+        <w:spacing w:before="60" w:after="100" w:line="360" w:lineRule="auto"/>
+        <w:jc w:val="both"/>
+        <w:rPr>
+          <w:rFonts w:ascii="Times New Roman" w:hAnsi="Times New Roman" w:cs="Times New Roman"/>
+          <w:sz w:val="28"/>
+          <w:szCs w:val="28"/>
+        </w:rPr>
+      </w:pPr>
+      <w:r>
+        <w:rPr>
+          <w:rFonts w:ascii="Times New Roman" w:hAnsi="Times New Roman" w:cs="Times New Roman"/>
+          <w:sz w:val="28"/>
+          <w:szCs w:val="28"/>
+        </w:rPr>
+        <w:t>•  Tích hợp thành công trợ lý chatbot AI sử dụng mô hình ngôn ngữ lớn để tư vấn tự động hóa chính xác về size và chất liệu vải cho khách hàng.</w:t>
+      </w:r>
+    </w:p>
+    <w:p>
+      <w:pPr>
+        <w:spacing w:before="60" w:after="100" w:line="360" w:lineRule="auto"/>
+        <w:jc w:val="both"/>
+        <w:rPr>
+          <w:rFonts w:ascii="Times New Roman" w:hAnsi="Times New Roman" w:cs="Times New Roman"/>
+          <w:sz w:val="28"/>
+          <w:szCs w:val="28"/>
+        </w:rPr>
+      </w:pPr>
+      <w:r>
+        <w:rPr>
+          <w:rFonts w:ascii="Times New Roman" w:hAnsi="Times New Roman" w:cs="Times New Roman"/>
+          <w:sz w:val="28"/>
+          <w:szCs w:val="28"/>
+        </w:rPr>
+        <w:t>•  Khắc phục triệt để lỗ hổng bảo mật đăng nhập và loại bỏ toàn bộ thông tin xác thực cứng (credentials) trong mã nguồn.</w:t>
+      </w:r>
+    </w:p>
+    <w:p>
+      <w:r>
+        <w:br w:type="page"/>
+      </w:r>
+    </w:p>
+    <w:p>
+      <w:pPr>
+        <w:pStyle w:val="Heading1"/>
+        <w:spacing w:before="240" w:after="120"/>
+        <w:rPr>
+          <w:rFonts w:ascii="Times New Roman" w:hAnsi="Times New Roman" w:cs="Times New Roman"/>
+          <w:sz w:val="28"/>
+          <w:szCs w:val="28"/>
+          <w:b/>
+        </w:rPr>
+      </w:pPr>
+      <w:r>
+        <w:rPr>
+          <w:rFonts w:ascii="Times New Roman" w:hAnsi="Times New Roman" w:cs="Times New Roman"/>
+          <w:sz w:val="28"/>
+          <w:szCs w:val="28"/>
+          <w:b/>
+        </w:rPr>
+        <w:t>HƯỚNG PHÁT TRIỂN ĐỀ TÀI</w:t>
+      </w:r>
+    </w:p>
+    <w:p>
+      <w:pPr>
+        <w:spacing w:before="60" w:after="100" w:line="360" w:lineRule="auto"/>
+        <w:jc w:val="both"/>
+        <w:rPr>
+          <w:rFonts w:ascii="Times New Roman" w:hAnsi="Times New Roman" w:cs="Times New Roman"/>
+          <w:sz w:val="28"/>
+          <w:szCs w:val="28"/>
+        </w:rPr>
+      </w:pPr>
+      <w:r>
+        <w:rPr>
+          <w:rFonts w:ascii="Times New Roman" w:hAnsi="Times New Roman" w:cs="Times New Roman"/>
+          <w:sz w:val="28"/>
+          <w:szCs w:val="28"/>
+        </w:rPr>
+        <w:t>Để hệ thống có tính ứng dụng thực tiễn cao hơn và sẵn sàng đưa vào vận hành thương mại trên thị trường, đề tài có thể phát triển thêm các nội dung sau:</w:t>
+      </w:r>
+    </w:p>
+    <w:p>
+      <w:pPr>
+        <w:spacing w:before="60" w:after="100" w:line="360" w:lineRule="auto"/>
+        <w:jc w:val="both"/>
+        <w:rPr>
+          <w:rFonts w:ascii="Times New Roman" w:hAnsi="Times New Roman" w:cs="Times New Roman"/>
+          <w:sz w:val="28"/>
+          <w:szCs w:val="28"/>
+        </w:rPr>
+      </w:pPr>
+      <w:r>
+        <w:rPr>
+          <w:rFonts w:ascii="Times New Roman" w:hAnsi="Times New Roman" w:cs="Times New Roman"/>
+          <w:sz w:val="28"/>
+          <w:szCs w:val="28"/>
+        </w:rPr>
+        <w:t>•  Kết nối toàn bộ giỏ hàng, thông tin thanh toán của Frontend Next.js với PostgreSQL database thông qua hệ thống API Backend Laravel hoàn chỉnh thay vì lưu trữ cục bộ qua localStorage của client.</w:t>
+      </w:r>
+    </w:p>
+    <w:p>
+      <w:pPr>
+        <w:spacing w:before="60" w:after="100" w:line="360" w:lineRule="auto"/>
+        <w:jc w:val="both"/>
+        <w:rPr>
+          <w:rFonts w:ascii="Times New Roman" w:hAnsi="Times New Roman" w:cs="Times New Roman"/>
+          <w:sz w:val="28"/>
+          <w:szCs w:val="28"/>
+        </w:rPr>
+      </w:pPr>
+      <w:r>
+        <w:rPr>
+          <w:rFonts w:ascii="Times New Roman" w:hAnsi="Times New Roman" w:cs="Times New Roman"/>
+          <w:sz w:val="28"/>
+          <w:szCs w:val="28"/>
+        </w:rPr>
+        <w:t>•  Tích hợp cổng thanh toán trực tuyến thực tế (VNPAY, MoMo, VNPT Pay) giúp khách hàng có thể thực hiện thanh toán trực tuyến an toàn.</w:t>
+      </w:r>
+    </w:p>
+    <w:p>
+      <w:pPr>
+        <w:spacing w:before="60" w:after="100" w:line="360" w:lineRule="auto"/>
+        <w:jc w:val="both"/>
+        <w:rPr>
+          <w:rFonts w:ascii="Times New Roman" w:hAnsi="Times New Roman" w:cs="Times New Roman"/>
+          <w:sz w:val="28"/>
+          <w:szCs w:val="28"/>
+        </w:rPr>
+      </w:pPr>
+      <w:r>
+        <w:rPr>
+          <w:rFonts w:ascii="Times New Roman" w:hAnsi="Times New Roman" w:cs="Times New Roman"/>
+          <w:sz w:val="28"/>
+          <w:szCs w:val="28"/>
+        </w:rPr>
+        <w:t>•  Xây dựng hệ thống gợi ý sản phẩm cá nhân hóa (Recommendation System) dựa trên hành vi duyệt web và lịch sử mua sắm của từng khách hàng cụ thể thông qua học máy (Machine Learning).</w:t>
+      </w:r>
+    </w:p>
+    <w:p>
+      <w:r>
+        <w:br w:type="page"/>
+      </w:r>
+    </w:p>
+    <w:p>
+      <w:pPr>
+        <w:pStyle w:val="Heading1"/>
+        <w:spacing w:before="240" w:after="120"/>
+        <w:rPr>
+          <w:rFonts w:ascii="Times New Roman" w:hAnsi="Times New Roman" w:cs="Times New Roman"/>
+          <w:sz w:val="28"/>
+          <w:szCs w:val="28"/>
+          <w:b/>
+        </w:rPr>
+      </w:pPr>
+      <w:r>
+        <w:rPr>
+          <w:rFonts w:ascii="Times New Roman" w:hAnsi="Times New Roman" w:cs="Times New Roman"/>
+          <w:sz w:val="28"/>
+          <w:szCs w:val="28"/>
+          <w:b/>
+        </w:rPr>
+        <w:t>D. TÀI LIỆU THAM KHẢO</w:t>
+      </w:r>
+    </w:p>
+    <w:p>
+      <w:pPr>
+        <w:spacing w:before="60" w:after="100" w:line="360" w:lineRule="auto"/>
+        <w:jc w:val="both"/>
+        <w:rPr>
+          <w:rFonts w:ascii="Times New Roman" w:hAnsi="Times New Roman" w:cs="Times New Roman"/>
+          <w:sz w:val="28"/>
+          <w:szCs w:val="28"/>
+        </w:rPr>
+      </w:pPr>
+      <w:r>
+        <w:rPr>
+          <w:rFonts w:ascii="Times New Roman" w:hAnsi="Times New Roman" w:cs="Times New Roman"/>
+          <w:sz w:val="28"/>
+          <w:szCs w:val="28"/>
+        </w:rPr>
+        <w:t>1. Trần Minh Chánh, Giáo trình Phân cứng máy tính và Kiến trúc hệ thống, Nhà xuất bản Giáo dục Việt Nam, Hà Nội, 2020.</w:t>
+      </w:r>
+    </w:p>
+    <w:p>
+      <w:pPr>
+        <w:spacing w:before="60" w:after="100" w:line="360" w:lineRule="auto"/>
+        <w:jc w:val="both"/>
+        <w:rPr>
+          <w:rFonts w:ascii="Times New Roman" w:hAnsi="Times New Roman" w:cs="Times New Roman"/>
+          <w:sz w:val="28"/>
+          <w:szCs w:val="28"/>
+        </w:rPr>
+      </w:pPr>
+      <w:r>
+        <w:rPr>
+          <w:rFonts w:ascii="Times New Roman" w:hAnsi="Times New Roman" w:cs="Times New Roman"/>
+          <w:sz w:val="28"/>
+          <w:szCs w:val="28"/>
+        </w:rPr>
+        <w:t>2. Nguyễn Văn A, Cơ sở Công nghệ Thông tin và Phát triển Web hiện đại, Nhà xuất bản Thống kê, Hà Nội, 2019.</w:t>
+      </w:r>
+    </w:p>
+    <w:p>
+      <w:pPr>
+        <w:spacing w:before="60" w:after="100" w:line="360" w:lineRule="auto"/>
+        <w:jc w:val="both"/>
+        <w:rPr>
+          <w:rFonts w:ascii="Times New Roman" w:hAnsi="Times New Roman" w:cs="Times New Roman"/>
+          <w:sz w:val="28"/>
+          <w:szCs w:val="28"/>
+        </w:rPr>
+      </w:pPr>
+      <w:r>
+        <w:rPr>
+          <w:rFonts w:ascii="Times New Roman" w:hAnsi="Times New Roman" w:cs="Times New Roman"/>
+          <w:sz w:val="28"/>
+          <w:szCs w:val="28"/>
+        </w:rPr>
+        <w:t>3. Lê Hoàng Nam, Quản trị hệ thống và bảo trì mạng doanh nghiệp, Nhà xuất bản Lao động – Xã hội, 2021.</w:t>
+      </w:r>
+    </w:p>
+    <w:p>
+      <w:pPr>
+        <w:spacing w:before="60" w:after="100" w:line="360" w:lineRule="auto"/>
+        <w:jc w:val="both"/>
+        <w:rPr>
+          <w:rFonts w:ascii="Times New Roman" w:hAnsi="Times New Roman" w:cs="Times New Roman"/>
+          <w:sz w:val="28"/>
+          <w:szCs w:val="28"/>
+        </w:rPr>
+      </w:pPr>
+      <w:r>
+        <w:rPr>
+          <w:rFonts w:ascii="Times New Roman" w:hAnsi="Times New Roman" w:cs="Times New Roman"/>
+          <w:sz w:val="28"/>
+          <w:szCs w:val="28"/>
+        </w:rPr>
+        <w:t>4. Qdrant Documentation, Vector Database for Semantic Search and Neural Networks Query, https://qdrant.tech/documentation/, 2026.</w:t>
+      </w:r>
+    </w:p>
+    <w:p>
+      <w:pPr>
+        <w:spacing w:before="60" w:after="100" w:line="360" w:lineRule="auto"/>
+        <w:jc w:val="both"/>
+        <w:rPr>
+          <w:rFonts w:ascii="Times New Roman" w:hAnsi="Times New Roman" w:cs="Times New Roman"/>
+          <w:sz w:val="28"/>
+          <w:szCs w:val="28"/>
+        </w:rPr>
+      </w:pPr>
+      <w:r>
+        <w:rPr>
+          <w:rFonts w:ascii="Times New Roman" w:hAnsi="Times New Roman" w:cs="Times New Roman"/>
+          <w:sz w:val="28"/>
+          <w:szCs w:val="28"/>
+        </w:rPr>
+        <w:t>5. Next.js Core Team, Next.js 16 App Router Architecture and Rendering Optimization, https://nextjs.org/docs, 2026.</w:t>
+      </w:r>
+    </w:p>
+    <w:p>
+      <w:pPr>
+        <w:spacing w:before="60" w:after="100" w:line="360" w:lineRule="auto"/>
+        <w:jc w:val="both"/>
+        <w:rPr>
+          <w:rFonts w:ascii="Times New Roman" w:hAnsi="Times New Roman" w:cs="Times New Roman"/>
+          <w:sz w:val="28"/>
+          <w:szCs w:val="28"/>
+        </w:rPr>
+      </w:pPr>
+      <w:r>
+        <w:rPr>
+          <w:rFonts w:ascii="Times New Roman" w:hAnsi="Times New Roman" w:cs="Times New Roman"/>
+          <w:sz w:val="28"/>
+          <w:szCs w:val="28"/>
+        </w:rPr>
+        <w:t>6. Laravel Documentation, Database Transactions and Pessimistic Locking Mechanisms, https://laravel.com/docs/11.x/database, 2026.</w:t>
+      </w:r>
+    </w:p>
+    <w:p>
+      <w:pPr>
+        <w:spacing w:before="60" w:after="100" w:line="360" w:lineRule="auto"/>
+        <w:jc w:val="both"/>
+        <w:rPr>
+          <w:rFonts w:ascii="Times New Roman" w:hAnsi="Times New Roman" w:cs="Times New Roman"/>
+          <w:sz w:val="28"/>
+          <w:szCs w:val="28"/>
+        </w:rPr>
+      </w:pPr>
+      <w:r>
+        <w:rPr>
+          <w:rFonts w:ascii="Times New Roman" w:hAnsi="Times New Roman" w:cs="Times New Roman"/>
+          <w:sz w:val="28"/>
+          <w:szCs w:val="28"/>
+        </w:rPr>
+        <w:t>7. APA Style Guide (7th Edition), Academic Writing and Citation Standards, https://apastyle.apa.org/, 2026.</w:t>
+      </w:r>
     </w:p>
     <w:sectPr>
       <w:pgSz w:w="12240" w:h="15840"/>
@@ -14986,7 +14730,7 @@
 </w:document>
 </file>
 
-<file path=word/endnotes.xml><?xml version="1.0" encoding="utf-8"?>
+<file path=word\endnotes.xml><?xml version="1.0" encoding="utf-8"?>
 <w:endnotes xmlns:wpc="http://schemas.microsoft.com/office/word/2010/wordprocessingCanvas" xmlns:cx="http://schemas.microsoft.com/office/drawing/2014/chartex" xmlns:cx1="http://schemas.microsoft.com/office/drawing/2015/9/8/chartex" xmlns:cx2="http://schemas.microsoft.com/office/drawing/2015/10/21/chartex" xmlns:cx3="http://schemas.microsoft.com/office/drawing/2016/5/9/chartex" xmlns:cx4="http://schemas.microsoft.com/office/drawing/2016/5/10/chartex" xmlns:cx5="http://schemas.microsoft.com/office/drawing/2016/5/11/chartex" xmlns:cx6="http://schemas.microsoft.com/office/drawing/2016/5/12/chartex" xmlns:cx7="http://schemas.microsoft.com/office/drawing/2016/5/13/chartex" xmlns:cx8="http://schemas.microsoft.com/office/drawing/2016/5/14/chartex" xmlns:mc="http://schemas.openxmlformats.org/markup-compatibility/2006" xmlns:aink="http://schemas.microsoft.com/office/drawing/2016/ink" xmlns:am3d="http://schemas.microsoft.com/office/drawing/2017/model3d" xmlns:o="urn:schemas-microsoft-com:office:office" xmlns:r="http://schemas.openxmlformats.org/officeDocument/2006/relationships" xmlns:m="http://schemas.openxmlformats.org/officeDocument/2006/math" xmlns:v="urn:schemas-microsoft-com:vml" xmlns:wp14="http://schemas.microsoft.com/office/word/2010/wordprocessingDrawing" xmlns:wp="http://schemas.openxmlformats.org/drawingml/2006/wordprocessingDrawing" xmlns:w10="urn:schemas-microsoft-com:office:word" xmlns:w="http://schemas.openxmlformats.org/wordprocessingml/2006/main" xmlns:w14="http://schemas.microsoft.com/office/word/2010/wordml" xmlns:w15="http://schemas.microsoft.com/office/word/2012/wordml" xmlns:w16cid="http://schemas.microsoft.com/office/word/2016/wordml/cid" xmlns:w16se="http://schemas.microsoft.com/office/word/2015/wordml/symex" xmlns:wpg="http://schemas.microsoft.com/office/word/2010/wordprocessingGroup" xmlns:wpi="http://schemas.microsoft.com/office/word/2010/wordprocessingInk" xmlns:wne="http://schemas.microsoft.com/office/word/2006/wordml" xmlns:wps="http://schemas.microsoft.com/office/word/2010/wordprocessingShape" mc:Ignorable="w14 w15 w16se w16cid wp14">
   <w:endnote w:type="separator" w:id="-1">
     <w:p>
@@ -15005,7 +14749,82 @@
 </w:endnotes>
 </file>
 
-<file path=word/footnotes.xml><?xml version="1.0" encoding="utf-8"?>
+<file path=word\fontTable.xml><?xml version="1.0" encoding="utf-8"?>
+<w:fonts xmlns:mc="http://schemas.openxmlformats.org/markup-compatibility/2006" xmlns:r="http://schemas.openxmlformats.org/officeDocument/2006/relationships" xmlns:w="http://schemas.openxmlformats.org/wordprocessingml/2006/main" xmlns:w14="http://schemas.microsoft.com/office/word/2010/wordml" xmlns:w15="http://schemas.microsoft.com/office/word/2012/wordml" xmlns:w16cid="http://schemas.microsoft.com/office/word/2016/wordml/cid" xmlns:w16se="http://schemas.microsoft.com/office/word/2015/wordml/symex" mc:Ignorable="w14 w15 w16se w16cid">
+  <w:font w:name="Symbol">
+    <w:panose1 w:val="05050102010706020507"/>
+    <w:charset w:val="02"/>
+    <w:family w:val="roman"/>
+    <w:pitch w:val="variable"/>
+    <w:sig w:usb0="00000000" w:usb1="10000000" w:usb2="00000000" w:usb3="00000000" w:csb0="80000000" w:csb1="00000000"/>
+  </w:font>
+  <w:font w:name="Times New Roman">
+    <w:panose1 w:val="02020603050405020304"/>
+    <w:charset w:val="00"/>
+    <w:family w:val="roman"/>
+    <w:pitch w:val="variable"/>
+    <w:sig w:usb0="E0002EFF" w:usb1="C000785B" w:usb2="00000009" w:usb3="00000000" w:csb0="000001FF" w:csb1="00000000"/>
+  </w:font>
+  <w:font w:name="Courier New">
+    <w:panose1 w:val="02070309020205020404"/>
+    <w:charset w:val="00"/>
+    <w:family w:val="modern"/>
+    <w:pitch w:val="fixed"/>
+    <w:sig w:usb0="E0002EFF" w:usb1="C0007843" w:usb2="00000009" w:usb3="00000000" w:csb0="000001FF" w:csb1="00000000"/>
+  </w:font>
+  <w:font w:name="Wingdings">
+    <w:panose1 w:val="05000000000000000000"/>
+    <w:charset w:val="02"/>
+    <w:family w:val="auto"/>
+    <w:pitch w:val="variable"/>
+    <w:sig w:usb0="00000000" w:usb1="10000000" w:usb2="00000000" w:usb3="00000000" w:csb0="80000000" w:csb1="00000000"/>
+  </w:font>
+  <w:font w:name="Calibri">
+    <w:panose1 w:val="020F0502020204030204"/>
+    <w:charset w:val="00"/>
+    <w:family w:val="swiss"/>
+    <w:pitch w:val="variable"/>
+    <w:sig w:usb0="E4002EFF" w:usb1="C000247B" w:usb2="00000009" w:usb3="00000000" w:csb0="000001FF" w:csb1="00000000"/>
+  </w:font>
+  <w:font w:name="Calibri Light">
+    <w:panose1 w:val="020F0302020204030204"/>
+    <w:charset w:val="00"/>
+    <w:family w:val="swiss"/>
+    <w:pitch w:val="variable"/>
+    <w:sig w:usb0="E4002EFF" w:usb1="C000247B" w:usb2="00000009" w:usb3="00000000" w:csb0="000001FF" w:csb1="00000000"/>
+  </w:font>
+  <w:font w:name="Cambria">
+    <w:panose1 w:val="02040503050406030204"/>
+    <w:charset w:val="00"/>
+    <w:family w:val="roman"/>
+    <w:pitch w:val="variable"/>
+    <w:sig w:usb0="E00006FF" w:usb1="420024FF" w:usb2="02000000" w:usb3="00000000" w:csb0="0000019F" w:csb1="00000000"/>
+  </w:font>
+  <w:font w:name="Segoe UI">
+    <w:panose1 w:val="020B0502040204020203"/>
+    <w:charset w:val="00"/>
+    <w:family w:val="swiss"/>
+    <w:pitch w:val="variable"/>
+    <w:sig w:usb0="E4002EFF" w:usb1="C000E47F" w:usb2="00000009" w:usb3="00000000" w:csb0="000001FF" w:csb1="00000000"/>
+  </w:font>
+  <w:font w:name="Consolas">
+    <w:panose1 w:val="020B0609020204030204"/>
+    <w:charset w:val="00"/>
+    <w:family w:val="modern"/>
+    <w:pitch w:val="fixed"/>
+    <w:sig w:usb0="E00006FF" w:usb1="0000FCFF" w:usb2="00000001" w:usb3="00000000" w:csb0="0000019F" w:csb1="00000000"/>
+  </w:font>
+  <w:font w:name="Cambria Math">
+    <w:panose1 w:val="02040503050406030204"/>
+    <w:charset w:val="00"/>
+    <w:family w:val="roman"/>
+    <w:pitch w:val="variable"/>
+    <w:sig w:usb0="E00006FF" w:usb1="420024FF" w:usb2="02000000" w:usb3="00000000" w:csb0="0000019F" w:csb1="00000000"/>
+  </w:font>
+</w:fonts>
+</file>
+
+<file path=word\footnotes.xml><?xml version="1.0" encoding="utf-8"?>
 <w:footnotes xmlns:wpc="http://schemas.microsoft.com/office/word/2010/wordprocessingCanvas" xmlns:cx="http://schemas.microsoft.com/office/drawing/2014/chartex" xmlns:cx1="http://schemas.microsoft.com/office/drawing/2015/9/8/chartex" xmlns:cx2="http://schemas.microsoft.com/office/drawing/2015/10/21/chartex" xmlns:cx3="http://schemas.microsoft.com/office/drawing/2016/5/9/chartex" xmlns:cx4="http://schemas.microsoft.com/office/drawing/2016/5/10/chartex" xmlns:cx5="http://schemas.microsoft.com/office/drawing/2016/5/11/chartex" xmlns:cx6="http://schemas.microsoft.com/office/drawing/2016/5/12/chartex" xmlns:cx7="http://schemas.microsoft.com/office/drawing/2016/5/13/chartex" xmlns:cx8="http://schemas.microsoft.com/office/drawing/2016/5/14/chartex" xmlns:mc="http://schemas.openxmlformats.org/markup-compatibility/2006" xmlns:aink="http://schemas.microsoft.com/office/drawing/2016/ink" xmlns:am3d="http://schemas.microsoft.com/office/drawing/2017/model3d" xmlns:o="urn:schemas-microsoft-com:office:office" xmlns:r="http://schemas.openxmlformats.org/officeDocument/2006/relationships" xmlns:m="http://schemas.openxmlformats.org/officeDocument/2006/math" xmlns:v="urn:schemas-microsoft-com:vml" xmlns:wp14="http://schemas.microsoft.com/office/word/2010/wordprocessingDrawing" xmlns:wp="http://schemas.openxmlformats.org/drawingml/2006/wordprocessingDrawing" xmlns:w10="urn:schemas-microsoft-com:office:word" xmlns:w="http://schemas.openxmlformats.org/wordprocessingml/2006/main" xmlns:w14="http://schemas.microsoft.com/office/word/2010/wordml" xmlns:w15="http://schemas.microsoft.com/office/word/2012/wordml" xmlns:w16cid="http://schemas.microsoft.com/office/word/2016/wordml/cid" xmlns:w16se="http://schemas.microsoft.com/office/word/2015/wordml/symex" xmlns:wpg="http://schemas.microsoft.com/office/word/2010/wordprocessingGroup" xmlns:wpi="http://schemas.microsoft.com/office/word/2010/wordprocessingInk" xmlns:wne="http://schemas.microsoft.com/office/word/2006/wordml" xmlns:wps="http://schemas.microsoft.com/office/word/2010/wordprocessingShape" mc:Ignorable="w14 w15 w16se w16cid wp14">
   <w:footnote w:type="separator" w:id="-1">
     <w:p>
@@ -15024,7 +14843,7 @@
 </w:footnotes>
 </file>
 
-<file path=word/numbering.xml><?xml version="1.0" encoding="utf-8"?>
+<file path=word\numbering.xml><?xml version="1.0" encoding="utf-8"?>
 <w:numbering xmlns:wpc="http://schemas.microsoft.com/office/word/2010/wordprocessingCanvas" xmlns:cx="http://schemas.microsoft.com/office/drawing/2014/chartex" xmlns:cx1="http://schemas.microsoft.com/office/drawing/2015/9/8/chartex" xmlns:cx2="http://schemas.microsoft.com/office/drawing/2015/10/21/chartex" xmlns:cx3="http://schemas.microsoft.com/office/drawing/2016/5/9/chartex" xmlns:cx4="http://schemas.microsoft.com/office/drawing/2016/5/10/chartex" xmlns:cx5="http://schemas.microsoft.com/office/drawing/2016/5/11/chartex" xmlns:cx6="http://schemas.microsoft.com/office/drawing/2016/5/12/chartex" xmlns:cx7="http://schemas.microsoft.com/office/drawing/2016/5/13/chartex" xmlns:cx8="http://schemas.microsoft.com/office/drawing/2016/5/14/chartex" xmlns:mc="http://schemas.openxmlformats.org/markup-compatibility/2006" xmlns:aink="http://schemas.microsoft.com/office/drawing/2016/ink" xmlns:am3d="http://schemas.microsoft.com/office/drawing/2017/model3d" xmlns:o="urn:schemas-microsoft-com:office:office" xmlns:r="http://schemas.openxmlformats.org/officeDocument/2006/relationships" xmlns:m="http://schemas.openxmlformats.org/officeDocument/2006/math" xmlns:v="urn:schemas-microsoft-com:vml" xmlns:wp14="http://schemas.microsoft.com/office/word/2010/wordprocessingDrawing" xmlns:wp="http://schemas.openxmlformats.org/drawingml/2006/wordprocessingDrawing" xmlns:w10="urn:schemas-microsoft-com:office:word" xmlns:w="http://schemas.openxmlformats.org/wordprocessingml/2006/main" xmlns:w14="http://schemas.microsoft.com/office/word/2010/wordml" xmlns:w15="http://schemas.microsoft.com/office/word/2012/wordml" xmlns:w16cid="http://schemas.microsoft.com/office/word/2016/wordml/cid" xmlns:w16se="http://schemas.microsoft.com/office/word/2015/wordml/symex" xmlns:wpg="http://schemas.microsoft.com/office/word/2010/wordprocessingGroup" xmlns:wpi="http://schemas.microsoft.com/office/word/2010/wordprocessingInk" xmlns:wne="http://schemas.microsoft.com/office/word/2006/wordml" xmlns:wps="http://schemas.microsoft.com/office/word/2010/wordprocessingShape" mc:Ignorable="w14 w15 w16se w16cid wp14">
   <w:abstractNum w:abstractNumId="0" w15:restartNumberingAfterBreak="0">
     <w:nsid w:val="0505522A"/>
@@ -17129,7 +16948,87 @@
 </w:numbering>
 </file>
 
-<file path=word/styles.xml><?xml version="1.0" encoding="utf-8"?>
+<file path=word\settings.xml><?xml version="1.0" encoding="utf-8"?>
+<w:settings xmlns:mc="http://schemas.openxmlformats.org/markup-compatibility/2006" xmlns:o="urn:schemas-microsoft-com:office:office" xmlns:r="http://schemas.openxmlformats.org/officeDocument/2006/relationships" xmlns:m="http://schemas.openxmlformats.org/officeDocument/2006/math" xmlns:v="urn:schemas-microsoft-com:vml" xmlns:w10="urn:schemas-microsoft-com:office:word" xmlns:w="http://schemas.openxmlformats.org/wordprocessingml/2006/main" xmlns:w14="http://schemas.microsoft.com/office/word/2010/wordml" xmlns:w15="http://schemas.microsoft.com/office/word/2012/wordml" xmlns:w16cid="http://schemas.microsoft.com/office/word/2016/wordml/cid" xmlns:w16se="http://schemas.microsoft.com/office/word/2015/wordml/symex" xmlns:sl="http://schemas.openxmlformats.org/schemaLibrary/2006/main" mc:Ignorable="w14 w15 w16se w16cid">
+  <w:zoom w:percent="100"/>
+  <w:hideSpellingErrors/>
+  <w:defaultTabStop w:val="720"/>
+  <w:characterSpacingControl w:val="doNotCompress"/>
+  <w:footnotePr>
+    <w:footnote w:id="-1"/>
+    <w:footnote w:id="0"/>
+  </w:footnotePr>
+  <w:endnotePr>
+    <w:endnote w:id="-1"/>
+    <w:endnote w:id="0"/>
+  </w:endnotePr>
+  <w:compat>
+    <w:compatSetting w:name="compatibilityMode" w:uri="http://schemas.microsoft.com/office/word" w:val="15"/>
+    <w:compatSetting w:name="overrideTableStyleFontSizeAndJustification" w:uri="http://schemas.microsoft.com/office/word" w:val="1"/>
+    <w:compatSetting w:name="enableOpenTypeFeatures" w:uri="http://schemas.microsoft.com/office/word" w:val="1"/>
+    <w:compatSetting w:name="doNotFlipMirrorIndents" w:uri="http://schemas.microsoft.com/office/word" w:val="1"/>
+    <w:compatSetting w:name="differentiateMultirowTableHeaders" w:uri="http://schemas.microsoft.com/office/word" w:val="1"/>
+    <w:compatSetting w:name="useWord2013TrackBottomHyphenation" w:uri="http://schemas.microsoft.com/office/word" w:val="1"/>
+  </w:compat>
+  <w:rsids>
+    <w:rsidRoot w:val="008D3FE2"/>
+    <w:rsid w:val="00031CF7"/>
+    <w:rsid w:val="001E6FB1"/>
+    <w:rsid w:val="00387D37"/>
+    <w:rsid w:val="005E4F19"/>
+    <w:rsid w:val="00620F60"/>
+    <w:rsid w:val="00626361"/>
+    <w:rsid w:val="00671F46"/>
+    <w:rsid w:val="00690575"/>
+    <w:rsid w:val="006F7790"/>
+    <w:rsid w:val="0074264D"/>
+    <w:rsid w:val="00745495"/>
+    <w:rsid w:val="007678AE"/>
+    <w:rsid w:val="0078753A"/>
+    <w:rsid w:val="00822C4C"/>
+    <w:rsid w:val="008D3FE2"/>
+    <w:rsid w:val="00920190"/>
+    <w:rsid w:val="009D3E0D"/>
+    <w:rsid w:val="009D512C"/>
+    <w:rsid w:val="00B30B1F"/>
+    <w:rsid w:val="00B33152"/>
+    <w:rsid w:val="00BD3186"/>
+    <w:rsid w:val="00BD3CB9"/>
+    <w:rsid w:val="00BF4FEA"/>
+    <w:rsid w:val="00DD0964"/>
+    <w:rsid w:val="00E01BF1"/>
+    <w:rsid w:val="00E754A8"/>
+  </w:rsids>
+  <m:mathPr>
+    <m:mathFont m:val="Cambria Math"/>
+    <m:brkBin m:val="before"/>
+    <m:brkBinSub m:val="--"/>
+    <m:smallFrac m:val="0"/>
+    <m:dispDef/>
+    <m:lMargin m:val="0"/>
+    <m:rMargin m:val="0"/>
+    <m:defJc m:val="centerGroup"/>
+    <m:wrapIndent m:val="1440"/>
+    <m:intLim m:val="subSup"/>
+    <m:naryLim m:val="undOvr"/>
+  </m:mathPr>
+  <w:themeFontLang w:val="en-US"/>
+  <w:clrSchemeMapping w:bg1="light1" w:t1="dark1" w:bg2="light2" w:t2="dark2" w:accent1="accent1" w:accent2="accent2" w:accent3="accent3" w:accent4="accent4" w:accent5="accent5" w:accent6="accent6" w:hyperlink="hyperlink" w:followedHyperlink="followedHyperlink"/>
+  <w:shapeDefaults>
+    <o:shapedefaults v:ext="edit" spidmax="1026"/>
+    <o:shapelayout v:ext="edit">
+      <o:idmap v:ext="edit" data="1"/>
+    </o:shapelayout>
+  </w:shapeDefaults>
+  <w:decimalSymbol w:val="."/>
+  <w:listSeparator w:val=","/>
+  <w14:docId w14:val="0C6A271D"/>
+  <w15:chartTrackingRefBased/>
+  <w15:docId w15:val="{8CBBD5E9-13DD-4F39-86CC-3B47D63753AB}"/>
+</w:settings>
+</file>
+
+<file path=word\styles.xml><?xml version="1.0" encoding="utf-8"?>
 <w:styles xmlns:mc="http://schemas.openxmlformats.org/markup-compatibility/2006" xmlns:r="http://schemas.openxmlformats.org/officeDocument/2006/relationships" xmlns:w="http://schemas.openxmlformats.org/wordprocessingml/2006/main" xmlns:w14="http://schemas.microsoft.com/office/word/2010/wordml" xmlns:w15="http://schemas.microsoft.com/office/word/2012/wordml" xmlns:w16cid="http://schemas.microsoft.com/office/word/2016/wordml/cid" xmlns:w16se="http://schemas.microsoft.com/office/word/2015/wordml/symex" mc:Ignorable="w14 w15 w16se w16cid">
   <w:docDefaults>
     <w:rPrDefault>
@@ -17978,7 +17877,7 @@
 </w:styles>
 </file>
 
-<file path=word/theme/theme1.xml><?xml version="1.0" encoding="utf-8"?>
+<file path=word\theme\theme1.xml><?xml version="1.0" encoding="utf-8"?>
 <a:theme xmlns:a="http://schemas.openxmlformats.org/drawingml/2006/main" name="Office Theme">
   <a:themeElements>
     <a:clrScheme name="Office">
@@ -18239,14 +18138,9 @@
 </a:theme>
 </file>
 
-<file path=customXml/item1.xml><?xml version="1.0" encoding="utf-8"?>
-<b:Sources xmlns:b="http://schemas.openxmlformats.org/officeDocument/2006/bibliography" xmlns="http://schemas.openxmlformats.org/officeDocument/2006/bibliography" SelectedStyle="\APASixthEditionOfficeOnline.xsl" StyleName="APA" Version="6"/>
-</file>
-
-<file path=customXml/itemProps1.xml><?xml version="1.0" encoding="utf-8"?>
-<ds:datastoreItem xmlns:ds="http://schemas.openxmlformats.org/officeDocument/2006/customXml" ds:itemID="{C6EDB017-1FD4-4134-B78E-F4DB6640129F}">
-  <ds:schemaRefs>
-    <ds:schemaRef ds:uri="http://schemas.openxmlformats.org/officeDocument/2006/bibliography"/>
-  </ds:schemaRefs>
-</ds:datastoreItem>
+<file path=word\webSettings.xml><?xml version="1.0" encoding="utf-8"?>
+<w:webSettings xmlns:mc="http://schemas.openxmlformats.org/markup-compatibility/2006" xmlns:r="http://schemas.openxmlformats.org/officeDocument/2006/relationships" xmlns:w="http://schemas.openxmlformats.org/wordprocessingml/2006/main" xmlns:w14="http://schemas.microsoft.com/office/word/2010/wordml" xmlns:w15="http://schemas.microsoft.com/office/word/2012/wordml" xmlns:w16cid="http://schemas.microsoft.com/office/word/2016/wordml/cid" xmlns:w16se="http://schemas.microsoft.com/office/word/2015/wordml/symex" mc:Ignorable="w14 w15 w16se w16cid">
+  <w:optimizeForBrowser/>
+  <w:allowPNG/>
+</w:webSettings>
 </file>
</xml_diff>